<commit_message>
drill: v1 vs v2 evidence for the dataset v2 PR (5 seeds, merged CI config)
</commit_message>
<xml_diff>
--- a/reports/report.docx
+++ b/reports/report.docx
@@ -1970,7 +1970,7 @@
               <w:rPr>
                 <w:sz w:val="16"/>
               </w:rPr>
-              <w:t>+0.0066</w:t>
+              <w:t>+0.0068</w:t>
             </w:r>
           </w:p>
         </w:tc>
@@ -1983,7 +1983,7 @@
               <w:rPr>
                 <w:sz w:val="16"/>
               </w:rPr>
-              <w:t>0.0268</w:t>
+              <w:t>0.0280</w:t>
             </w:r>
           </w:p>
         </w:tc>
@@ -2009,7 +2009,7 @@
               <w:rPr>
                 <w:sz w:val="16"/>
               </w:rPr>
-              <w:t>0.61</w:t>
+              <w:t>0.62</w:t>
             </w:r>
           </w:p>
         </w:tc>
@@ -2037,7 +2037,7 @@
               <w:rPr>
                 <w:sz w:val="16"/>
               </w:rPr>
-              <w:t>−0.0004</w:t>
+              <w:t>+0.0002</w:t>
             </w:r>
           </w:p>
         </w:tc>
@@ -2050,7 +2050,7 @@
               <w:rPr>
                 <w:sz w:val="16"/>
               </w:rPr>
-              <w:t>0.0126</w:t>
+              <w:t>0.0144</w:t>
             </w:r>
           </w:p>
         </w:tc>
@@ -2076,7 +2076,7 @@
               <w:rPr>
                 <w:sz w:val="16"/>
               </w:rPr>
-              <w:t>0.95</w:t>
+              <w:t>0.97</w:t>
             </w:r>
           </w:p>
         </w:tc>
@@ -2104,7 +2104,7 @@
               <w:rPr>
                 <w:sz w:val="16"/>
               </w:rPr>
-              <w:t>+0.0083</w:t>
+              <w:t>+0.0108</w:t>
             </w:r>
           </w:p>
         </w:tc>
@@ -2117,7 +2117,7 @@
               <w:rPr>
                 <w:sz w:val="16"/>
               </w:rPr>
-              <w:t>0.0056</w:t>
+              <w:t>0.0079</w:t>
             </w:r>
           </w:p>
         </w:tc>
@@ -2143,7 +2143,7 @@
               <w:rPr>
                 <w:sz w:val="16"/>
               </w:rPr>
-              <w:t>0.03</w:t>
+              <w:t>0.04</w:t>
             </w:r>
           </w:p>
         </w:tc>
@@ -2171,7 +2171,7 @@
               <w:rPr>
                 <w:sz w:val="16"/>
               </w:rPr>
-              <w:t>−0.0351</w:t>
+              <w:t>−0.0438</w:t>
             </w:r>
           </w:p>
         </w:tc>
@@ -2184,7 +2184,7 @@
               <w:rPr>
                 <w:sz w:val="16"/>
               </w:rPr>
-              <w:t>0.0556</w:t>
+              <w:t>0.0544</w:t>
             </w:r>
           </w:p>
         </w:tc>
@@ -2197,7 +2197,7 @@
               <w:rPr>
                 <w:sz w:val="16"/>
               </w:rPr>
-              <w:t>1/5</w:t>
+              <w:t>0/5</w:t>
             </w:r>
           </w:p>
         </w:tc>
@@ -2210,7 +2210,7 @@
               <w:rPr>
                 <w:sz w:val="16"/>
               </w:rPr>
-              <w:t>0.23</w:t>
+              <w:t>0.15</w:t>
             </w:r>
           </w:p>
         </w:tc>
@@ -2238,7 +2238,7 @@
         <w:pStyle w:val="ListBullet"/>
       </w:pPr>
       <w:r>
-        <w:t>That apparent gain is not real. Over seeds it is +0.007 ± 0.027, the same size as pure seed noise (sd 0.025). On identical customers the models are indistinguishable, and every seed's paired-bootstrap 95% interval contains 0.</w:t>
+        <w:t>That apparent gain is not real. Over seeds it is +0.007 ± 0.028, the same size as pure seed noise (sd 0.025). On identical customers the models are indistinguishable, and every seed's paired-bootstrap 95% interval contains 0.</w:t>
       </w:r>
     </w:p>
     <w:p>
@@ -2254,7 +2254,7 @@
         <w:pStyle w:val="ListBullet"/>
       </w:pPr>
       <w:r>
-        <w:t>The only consistent gain is small and expected (+0.008 on new customers).</w:t>
+        <w:t>The only consistent gain is small and expected (+0.011 on new customers, 5/5 seeds).</w:t>
       </w:r>
     </w:p>
     <w:p>

</xml_diff>

<commit_message>
docs: CI history evidence (PRs #1-#5), GitHub screenshots, branch protection, post-v2 restore logs, refreshed tracking export
</commit_message>
<xml_diff>
--- a/reports/report.docx
+++ b/reports/report.docx
@@ -37,7 +37,7 @@
         <w:rPr>
           <w:b/>
         </w:rPr>
-        <w:t>every change is versioned (Git + DVC), validated (Pydantic configs, data contract), tested (58 pytest tests), tracked (MLflow, 38 runs) and accepted only if a retrained model is not worse than a protected baseline (GitHub Actions gate)</w:t>
+        <w:t>every change is versioned (Git + DVC), validated (Pydantic configs, data contract), tested (58 pytest tests), tracked (MLflow, 49 runs) and accepted only if a retrained model is not worse than a protected baseline (GitHub Actions gate)</w:t>
       </w:r>
       <w:r>
         <w:t>. We also chose the gate rule by replaying eight candidate rules against our own run history.</w:t>
@@ -1235,7 +1235,7 @@
         <w:t>baseline-guard</w:t>
       </w:r>
       <w:r>
-        <w:t xml:space="preserve"> job retrains and requires an exact (1e-6) match, so a hand-lowered baseline cannot merge. CODEOWNERS and branch protection cover the rest. The CI history shows three PRs:</w:t>
+        <w:t xml:space="preserve"> job retrains and requires an exact (1e-6) match, so a hand-lowered baseline cannot merge. CODEOWNERS and branch protection cover the rest. The CI history on GitHub (https://github.com/tstnikhil4356/mlops-credit-risk-cicd-gate) shows:</w:t>
       </w:r>
     </w:p>
     <w:p>
@@ -1243,7 +1243,13 @@
         <w:pStyle w:val="ListBullet"/>
       </w:pPr>
       <w:r>
-        <w:t>PR 1 passes (wider C grid);</w:t>
+        <w:rPr>
+          <w:b/>
+        </w:rPr>
+        <w:t>#1 passes and merges</w:t>
+      </w:r>
+      <w:r>
+        <w:t xml:space="preserve"> (wider C grid);</w:t>
       </w:r>
     </w:p>
     <w:p>
@@ -1251,7 +1257,13 @@
         <w:pStyle w:val="ListBullet"/>
       </w:pPr>
       <w:r>
-        <w:t>PR 2 is blocked because the model is worse (delay features dropped);</w:t>
+        <w:rPr>
+          <w:b/>
+        </w:rPr>
+        <w:t>#2 is blocked because the model is worse</w:t>
+      </w:r>
+      <w:r>
+        <w:t>: delay features dropped, all tests pass, but PR-AUC 0.7830 (−0.093) and recall 0.82;</w:t>
       </w:r>
     </w:p>
     <w:p>
@@ -1259,17 +1271,44 @@
         <w:pStyle w:val="ListBullet"/>
       </w:pPr>
       <w:r>
-        <w:t xml:space="preserve">PR 3 is blocked by the failing test </w:t>
+        <w:rPr>
+          <w:b/>
+        </w:rPr>
+        <w:t>#3 is blocked by failing tests</w:t>
+      </w:r>
+      <w:r>
+        <w:t xml:space="preserve"> (zero-limit contract) even though the metrics did not move;</w:t>
+      </w:r>
+    </w:p>
+    <w:p>
+      <w:pPr>
+        <w:pStyle w:val="ListBullet"/>
+      </w:pPr>
+      <w:r>
+        <w:t>#4 brings in dataset v2;</w:t>
+      </w:r>
+    </w:p>
+    <w:p>
+      <w:pPr>
+        <w:pStyle w:val="ListBullet"/>
+      </w:pPr>
+      <w:r>
+        <w:t xml:space="preserve">#5 updates the baseline, which </w:t>
       </w:r>
       <w:r>
         <w:rPr>
           <w:rFonts w:ascii="Consolas" w:hAnsi="Consolas"/>
           <w:sz w:val="17"/>
         </w:rPr>
-        <w:t>test_ratio_zero_limit_with_balance_is_capped</w:t>
+        <w:t>baseline-guard</w:t>
       </w:r>
       <w:r>
-        <w:t>.</w:t>
+        <w:t xml:space="preserve"> rejected until it was labelled and then verified as reproducing exactly.</w:t>
+      </w:r>
+    </w:p>
+    <w:p>
+      <w:r>
+        <w:t>Linux CI reproduces the macOS numbers exactly (≈1 min per run).</w:t>
       </w:r>
     </w:p>
     <w:p>

</xml_diff>